<commit_message>
Update Study 1 Researcher instructions.docx
</commit_message>
<xml_diff>
--- a/method/study 1/experimenter (blinded)/Study 1 Researcher instructions.docx
+++ b/method/study 1/experimenter (blinded)/Study 1 Researcher instructions.docx
@@ -382,27 +382,7 @@
           <w:szCs w:val="20"/>
           <w:lang w:val="en-US"/>
         </w:rPr>
-        <w:t xml:space="preserve">value of “Participant ID”, “Target”, and “Order” to be recorded on their sheets, screen recording file name, and in the </w:t>
-      </w:r>
-      <w:proofErr w:type="spellStart"/>
-      <w:r>
-        <w:rPr>
-          <w:rFonts w:ascii="Times New Roman" w:hAnsi="Times New Roman" w:cs="Times New Roman"/>
-          <w:sz w:val="20"/>
-          <w:szCs w:val="20"/>
-          <w:lang w:val="en-US"/>
-        </w:rPr>
-        <w:t>pavlovia</w:t>
-      </w:r>
-      <w:proofErr w:type="spellEnd"/>
-      <w:r>
-        <w:rPr>
-          <w:rFonts w:ascii="Times New Roman" w:hAnsi="Times New Roman" w:cs="Times New Roman"/>
-          <w:sz w:val="20"/>
-          <w:szCs w:val="20"/>
-          <w:lang w:val="en-US"/>
-        </w:rPr>
-        <w:t xml:space="preserve"> experiment in the browser</w:t>
+        <w:t>value of “Participant ID”, “Target”, and “Order” to be recorded on their sheets, screen recording file name, and in the pavlovia experiment in the browser</w:t>
       </w:r>
       <w:r>
         <w:rPr>
@@ -491,27 +471,7 @@
           <w:szCs w:val="20"/>
           <w:lang w:val="en-US"/>
         </w:rPr>
-        <w:t xml:space="preserve">Have </w:t>
-      </w:r>
-      <w:proofErr w:type="spellStart"/>
-      <w:r>
-        <w:rPr>
-          <w:rFonts w:ascii="Times New Roman" w:hAnsi="Times New Roman" w:cs="Times New Roman"/>
-          <w:sz w:val="20"/>
-          <w:szCs w:val="20"/>
-          <w:lang w:val="en-US"/>
-        </w:rPr>
-        <w:t>ShareX</w:t>
-      </w:r>
-      <w:proofErr w:type="spellEnd"/>
-      <w:r>
-        <w:rPr>
-          <w:rFonts w:ascii="Times New Roman" w:hAnsi="Times New Roman" w:cs="Times New Roman"/>
-          <w:sz w:val="20"/>
-          <w:szCs w:val="20"/>
-          <w:lang w:val="en-US"/>
-        </w:rPr>
-        <w:t xml:space="preserve"> screen recorder installed and tested on the computers</w:t>
+        <w:t>Have ShareX screen recorder installed and tested on the computers</w:t>
       </w:r>
       <w:r>
         <w:rPr>
@@ -550,27 +510,7 @@
           <w:szCs w:val="20"/>
           <w:lang w:val="en-US"/>
         </w:rPr>
-        <w:t xml:space="preserve">. Ensure the computer’s microphones work. Familiarize yourself with </w:t>
-      </w:r>
-      <w:proofErr w:type="spellStart"/>
-      <w:r>
-        <w:rPr>
-          <w:rFonts w:ascii="Times New Roman" w:hAnsi="Times New Roman" w:cs="Times New Roman"/>
-          <w:sz w:val="20"/>
-          <w:szCs w:val="20"/>
-          <w:lang w:val="en-US"/>
-        </w:rPr>
-        <w:t>ShareX</w:t>
-      </w:r>
-      <w:proofErr w:type="spellEnd"/>
-      <w:r>
-        <w:rPr>
-          <w:rFonts w:ascii="Times New Roman" w:hAnsi="Times New Roman" w:cs="Times New Roman"/>
-          <w:sz w:val="20"/>
-          <w:szCs w:val="20"/>
-          <w:lang w:val="en-US"/>
-        </w:rPr>
-        <w:t xml:space="preserve"> and ensure that you can set it to record what is on screen as well as audio from the mic, while the study is running, and that you can end the recording, and save the recording using the participant code as its name. Audio and video from the screen recordings will be used later to score the data.</w:t>
+        <w:t>. Ensure the computer’s microphones work. Familiarize yourself with ShareX and ensure that you can set it to record what is on screen as well as audio from the mic, while the study is running, and that you can end the recording, and save the recording using the participant code as its name. Audio and video from the screen recordings will be used later to score the data.</w:t>
       </w:r>
     </w:p>
     <w:p>
@@ -1195,27 +1135,7 @@
           <w:szCs w:val="20"/>
           <w:lang w:val="en-US"/>
         </w:rPr>
-        <w:t xml:space="preserve"> in </w:t>
-      </w:r>
-      <w:proofErr w:type="spellStart"/>
-      <w:r>
-        <w:rPr>
-          <w:rFonts w:ascii="Times New Roman" w:hAnsi="Times New Roman" w:cs="Times New Roman"/>
-          <w:sz w:val="20"/>
-          <w:szCs w:val="20"/>
-          <w:lang w:val="en-US"/>
-        </w:rPr>
-        <w:t>ShareX</w:t>
-      </w:r>
-      <w:proofErr w:type="spellEnd"/>
-      <w:r>
-        <w:rPr>
-          <w:rFonts w:ascii="Times New Roman" w:hAnsi="Times New Roman" w:cs="Times New Roman"/>
-          <w:sz w:val="20"/>
-          <w:szCs w:val="20"/>
-          <w:lang w:val="en-US"/>
-        </w:rPr>
-        <w:t>.</w:t>
+        <w:t xml:space="preserve"> in ShareX.</w:t>
       </w:r>
     </w:p>
     <w:p>
@@ -2011,27 +1931,7 @@
           <w:szCs w:val="20"/>
           <w:lang w:val="en-US"/>
         </w:rPr>
-        <w:t xml:space="preserve"> in </w:t>
-      </w:r>
-      <w:proofErr w:type="spellStart"/>
-      <w:r>
-        <w:rPr>
-          <w:rFonts w:ascii="Times New Roman" w:hAnsi="Times New Roman" w:cs="Times New Roman"/>
-          <w:sz w:val="20"/>
-          <w:szCs w:val="20"/>
-          <w:lang w:val="en-US"/>
-        </w:rPr>
-        <w:t>ShareX</w:t>
-      </w:r>
-      <w:proofErr w:type="spellEnd"/>
-      <w:r>
-        <w:rPr>
-          <w:rFonts w:ascii="Times New Roman" w:hAnsi="Times New Roman" w:cs="Times New Roman"/>
-          <w:sz w:val="20"/>
-          <w:szCs w:val="20"/>
-          <w:lang w:val="en-US"/>
-        </w:rPr>
-        <w:t xml:space="preserve">; </w:t>
+        <w:t xml:space="preserve"> in ShareX; </w:t>
       </w:r>
       <w:r>
         <w:rPr>
@@ -2288,27 +2188,7 @@
           <w:szCs w:val="20"/>
           <w:lang w:val="en-US"/>
         </w:rPr>
-        <w:t xml:space="preserve">Ensure that Questionnaire 1, Questionnaire 2, and the screen recording file all have the correct participant code listed on them/as their file name – </w:t>
-      </w:r>
-      <w:proofErr w:type="spellStart"/>
-      <w:r>
-        <w:rPr>
-          <w:rFonts w:ascii="Times New Roman" w:hAnsi="Times New Roman" w:cs="Times New Roman"/>
-          <w:sz w:val="20"/>
-          <w:szCs w:val="20"/>
-          <w:lang w:val="en-US"/>
-        </w:rPr>
-        <w:t>ie</w:t>
-      </w:r>
-      <w:proofErr w:type="spellEnd"/>
-      <w:r>
-        <w:rPr>
-          <w:rFonts w:ascii="Times New Roman" w:hAnsi="Times New Roman" w:cs="Times New Roman"/>
-          <w:sz w:val="20"/>
-          <w:szCs w:val="20"/>
-          <w:lang w:val="en-US"/>
-        </w:rPr>
-        <w:t xml:space="preserve"> that it corresponds with the participant code written on the paper left on the desk where the participant sat.</w:t>
+        <w:t>Ensure that Questionnaire 1, Questionnaire 2, and the screen recording file all have the correct participant code listed on them/as their file name – ie that it corresponds with the participant code written on the paper left on the desk where the participant sat.</w:t>
       </w:r>
       <w:r>
         <w:rPr>
@@ -2740,47 +2620,7 @@
         <w:annotationRef/>
       </w:r>
       <w:r>
-        <w:t xml:space="preserve">Note to Anna/Ana: please, using the </w:t>
-      </w:r>
-      <w:proofErr w:type="spellStart"/>
-      <w:r>
-        <w:t>the</w:t>
-      </w:r>
-      <w:proofErr w:type="spellEnd"/>
-      <w:r>
-        <w:t xml:space="preserve"> </w:t>
-      </w:r>
-      <w:proofErr w:type="spellStart"/>
-      <w:r>
-        <w:t>pavlovia</w:t>
-      </w:r>
-      <w:proofErr w:type="spellEnd"/>
-      <w:r>
-        <w:t xml:space="preserve"> link above, estimate the total amount of time needed for the </w:t>
-      </w:r>
-      <w:proofErr w:type="spellStart"/>
-      <w:r>
-        <w:t>non practice</w:t>
-      </w:r>
-      <w:proofErr w:type="spellEnd"/>
-      <w:r>
-        <w:t xml:space="preserve"> trials to run. Add maybe another 30 seconds to this estimate in case the participant doesn’t start them immediately, or round this up to the nearest whole minute, and then replace XX with this number. </w:t>
-      </w:r>
-      <w:proofErr w:type="spellStart"/>
-      <w:r>
-        <w:t>Ie</w:t>
-      </w:r>
-      <w:proofErr w:type="spellEnd"/>
-      <w:r>
-        <w:t xml:space="preserve">, the instruction is to return to the cubicle if the participant doesn’t alert you that they’re finished, after an amount of time that could not  </w:t>
-      </w:r>
-      <w:proofErr w:type="spellStart"/>
-      <w:r>
-        <w:t>not</w:t>
-      </w:r>
-      <w:proofErr w:type="spellEnd"/>
-      <w:r>
-        <w:t xml:space="preserve"> interrupt them while doing the trials. </w:t>
+        <w:t xml:space="preserve">Note to Anna: please, using the the pavlovia link above, estimate the total amount of time needed for the non practice trials to run. Add maybe another 30 seconds to this estimate in case the participant doesn’t start them immediately, or round this up to the nearest whole minute, and then replace XX with this number. Ie, the instruction is to return to the cubicle if the participant doesn’t alert you that they’re finished, after an amount of time that could not  not interrupt them while doing the trials. </w:t>
       </w:r>
     </w:p>
   </w:comment>

</xml_diff>